<commit_message>
kleine verbetering in tekstopmaak en alinea-opdeling
</commit_message>
<xml_diff>
--- a/docs/Analyseren/JufAimee_Onderzoeksverslag final.docx
+++ b/docs/Analyseren/JufAimee_Onderzoeksverslag final.docx
@@ -389,19 +389,19 @@
     <w:bookmarkStart w:id="3" w:name="_Toc231285568" w:displacedByCustomXml="next"/>
     <w:sdt>
       <w:sdtPr>
+        <w:rPr>
+          <w:b w:val="0"/>
+          <w:bCs w:val="0"/>
+          <w:color w:val="auto"/>
+          <w:sz w:val="24"/>
+          <w:szCs w:val="24"/>
+        </w:rPr>
         <w:id w:val="1696807759"/>
         <w:docPartObj>
           <w:docPartGallery w:val="Table of Contents"/>
           <w:docPartUnique/>
         </w:docPartObj>
       </w:sdtPr>
-      <w:sdtEndPr>
-        <w:rPr>
-          <w:color w:val="auto"/>
-          <w:sz w:val="24"/>
-          <w:szCs w:val="24"/>
-        </w:rPr>
-      </w:sdtEndPr>
       <w:sdtContent>
         <w:p>
           <w:pPr>
@@ -4271,13 +4271,13 @@
           <w:bottom w:val="single" w:sz="4" w:space="4" w:color="2E75B6"/>
         </w:pBdr>
       </w:pPr>
-      <w:bookmarkStart w:id="4" w:name="_Toc230782938"/>
-      <w:bookmarkStart w:id="5" w:name="_Toc231285569"/>
+      <w:bookmarkStart w:id="4" w:name="_Toc231285569"/>
+      <w:bookmarkStart w:id="5" w:name="_Toc230782938"/>
       <w:r>
         <w:lastRenderedPageBreak/>
         <w:t>1. Inleiding</w:t>
       </w:r>
-      <w:bookmarkEnd w:id="5"/>
+      <w:bookmarkEnd w:id="4"/>
     </w:p>
     <w:p>
       <w:pPr>
@@ -4488,7 +4488,7 @@
         <w:lastRenderedPageBreak/>
         <w:t>2. Achtergrond en context</w:t>
       </w:r>
-      <w:bookmarkEnd w:id="4"/>
+      <w:bookmarkEnd w:id="5"/>
       <w:bookmarkEnd w:id="6"/>
       <w:bookmarkEnd w:id="7"/>
     </w:p>
@@ -5443,6 +5443,7 @@
       </w:r>
     </w:p>
     <w:p/>
+    <w:p/>
     <w:p>
       <w:pPr>
         <w:pStyle w:val="Kop3"/>
@@ -5451,6 +5452,7 @@
       <w:bookmarkStart w:id="77" w:name="_Toc231190409"/>
       <w:bookmarkStart w:id="78" w:name="_Toc231285592"/>
       <w:r>
+        <w:lastRenderedPageBreak/>
         <w:t>Signalensysteem</w:t>
       </w:r>
       <w:bookmarkEnd w:id="76"/>
@@ -5536,6 +5538,8 @@
         <w:t>Nadat de feedback is gegenereerd kan de leraar een heranalyse uitvoeren zodat het AI-model kritisch kan kijken naar de feedback en noodzakelijke verbeteringen kan doorvoeren.</w:t>
       </w:r>
     </w:p>
+    <w:p/>
+    <w:p/>
     <w:p/>
     <w:p/>
     <w:p/>
@@ -5610,7 +5614,6 @@
       </w:pPr>
       <w:bookmarkStart w:id="85" w:name="_Toc231285595"/>
       <w:r>
-        <w:lastRenderedPageBreak/>
         <w:t>6.4 Evaluatie van het proof of concept</w:t>
       </w:r>
       <w:bookmarkEnd w:id="85"/>
@@ -5805,15 +5808,7 @@
         <w:pStyle w:val="Geenafstand"/>
       </w:pPr>
       <w:r>
-        <w:t xml:space="preserve">Dit hoofdstuk brengt de bevindingen uit het theoretisch kader, het ontwerp en het gerealiseerde </w:t>
-      </w:r>
-      <w:proofErr w:type="spellStart"/>
-      <w:r>
-        <w:t>proof</w:t>
-      </w:r>
-      <w:proofErr w:type="spellEnd"/>
-      <w:r>
-        <w:t xml:space="preserve"> of concept samen en beantwoordt op basis daarvan de deelvragen en de hoofdvraag. Waar relevant wordt verwezen naar de eerder beschreven onderdelen van Juf Aimee.</w:t>
+        <w:t>Dit hoofdstuk brengt de bevindingen uit het theoretisch kader, het ontwerp en het gerealiseerde proof of concept samen en beantwoordt op basis daarvan de deelvragen en de hoofdvraag. Waar relevant wordt verwezen naar de eerder beschreven onderdelen van Juf Aimee.</w:t>
       </w:r>
     </w:p>
     <w:p>
@@ -5846,83 +5841,94 @@
           <w:i/>
           <w:iCs/>
         </w:rPr>
-        <w:t xml:space="preserve">Welke kenmerken en leerbehoeften van hoogbegaafde leerlingen zijn relevant voor het ontwerp van gepersonaliseerde, hogere-orde leeractiviteiten, en hoe sluiten deze aan op de Taxonomie van </w:t>
-      </w:r>
-      <w:proofErr w:type="spellStart"/>
-      <w:r>
+        <w:t>Welke kenmerken en leerbehoeften van hoogbegaafde leerlingen zijn relevant voor het ontwerp van gepersonaliseerde, hogere-orde leeractiviteiten, en hoe sluiten deze aan op de Taxonomie van Bloom?</w:t>
+      </w:r>
+    </w:p>
+    <w:p>
+      <w:pPr>
+        <w:pStyle w:val="Geenafstand"/>
+      </w:pPr>
+    </w:p>
+    <w:p>
+      <w:pPr>
+        <w:pStyle w:val="Geenafstand"/>
+      </w:pPr>
+      <w:r>
+        <w:t>Hoogbegaafde leerlingen hebben behoefte aan verdieping en verbreding in plaats van herhaling, aan uitdaging op hogere-orde denkniveaus (analyseren, evalueren, creëren) en aan opdrachten die aansluiten bij hun interesses, autonomie en werkstijl. "Meer van hetzelfde" leidt juist tot onderprikkeling en afhaken. Deze kenmerken zijn in Juf Aimee operationeel gemaakt via de Taxonomie van Bloom: elk leerlingprofiel en elke opdracht draagt een expliciet Bloom-niveau (1–6), en de opdrachtgeneratie stuurt gericht op het gewenste niveau met bijbehorende denkwerkwoorden. De relevante profielkenmerken</w:t>
+      </w:r>
+      <w:r>
+        <w:t xml:space="preserve">: </w:t>
+      </w:r>
+      <w:r>
+        <w:t>cognitief niveau, interesses, motivatietriggers, beperkingen en te vermijden onderwerpen worden uit het ontwikkelingsperspectief (OPP) gehaald en vormen de kern van de gegenereerde opdracht. Daarmee sluit het ontwerp direct aan op het pedagogische kader van Bloom en op de specifieke leerbehoeften van deze doelgroep.</w:t>
+      </w:r>
+    </w:p>
+    <w:p>
+      <w:pPr>
+        <w:pStyle w:val="Geenafstand"/>
+      </w:pPr>
+    </w:p>
+    <w:p>
+      <w:pPr>
+        <w:pStyle w:val="Kop2"/>
+      </w:pPr>
+      <w:bookmarkStart w:id="95" w:name="_Toc231238775"/>
+      <w:bookmarkStart w:id="96" w:name="_Toc231285601"/>
+      <w:r>
+        <w:t>7.2 Deelvraag 2 — Gebruikersbehoeften en rolverdeling</w:t>
+      </w:r>
+      <w:bookmarkEnd w:id="95"/>
+      <w:bookmarkEnd w:id="96"/>
+    </w:p>
+    <w:p>
+      <w:pPr>
+        <w:pStyle w:val="Geenafstand"/>
         <w:rPr>
           <w:i/>
           <w:iCs/>
         </w:rPr>
-        <w:t>Bloom</w:t>
-      </w:r>
-      <w:proofErr w:type="spellEnd"/>
+      </w:pPr>
       <w:r>
         <w:rPr>
           <w:i/>
           <w:iCs/>
         </w:rPr>
-        <w:t>?</w:t>
-      </w:r>
-    </w:p>
-    <w:p>
-      <w:pPr>
-        <w:pStyle w:val="Geenafstand"/>
-      </w:pPr>
-    </w:p>
-    <w:p>
-      <w:pPr>
-        <w:pStyle w:val="Geenafstand"/>
-      </w:pPr>
-      <w:r>
-        <w:t xml:space="preserve">Hoogbegaafde leerlingen hebben behoefte aan verdieping en verbreding in plaats van herhaling, aan uitdaging op hogere-orde denkniveaus (analyseren, evalueren, creëren) en aan opdrachten die aansluiten bij hun interesses, autonomie en werkstijl. "Meer van hetzelfde" leidt juist tot </w:t>
-      </w:r>
-      <w:proofErr w:type="spellStart"/>
-      <w:r>
-        <w:t>onderprikkeling</w:t>
-      </w:r>
-      <w:proofErr w:type="spellEnd"/>
-      <w:r>
-        <w:t xml:space="preserve"> en afhaken. Deze kenmerken zijn in Juf Aimee operationeel gemaakt via de Taxonomie van </w:t>
-      </w:r>
-      <w:proofErr w:type="spellStart"/>
-      <w:r>
-        <w:t>Bloom</w:t>
-      </w:r>
-      <w:proofErr w:type="spellEnd"/>
-      <w:r>
-        <w:t xml:space="preserve">: elk </w:t>
-      </w:r>
-      <w:proofErr w:type="spellStart"/>
-      <w:r>
-        <w:t>leerlingprofiel</w:t>
-      </w:r>
-      <w:proofErr w:type="spellEnd"/>
-      <w:r>
-        <w:t xml:space="preserve"> en elke opdracht draagt een expliciet </w:t>
-      </w:r>
-      <w:proofErr w:type="spellStart"/>
-      <w:r>
-        <w:t>Bloom</w:t>
-      </w:r>
-      <w:proofErr w:type="spellEnd"/>
-      <w:r>
-        <w:t>-niveau (1–6), en de opdrachtgeneratie stuurt gericht op het gewenste niveau met bijbehorende denkwerkwoorden. De relevante profielkenmerken</w:t>
-      </w:r>
-      <w:r>
-        <w:t xml:space="preserve">: </w:t>
-      </w:r>
-      <w:r>
-        <w:t xml:space="preserve">cognitief niveau, interesses, motivatietriggers, beperkingen en te vermijden onderwerpen worden uit het ontwikkelingsperspectief (OPP) gehaald en vormen de kern van de gegenereerde opdracht. Daarmee sluit het ontwerp direct aan op het pedagogische kader van </w:t>
-      </w:r>
-      <w:proofErr w:type="spellStart"/>
-      <w:r>
-        <w:t>Bloom</w:t>
-      </w:r>
-      <w:proofErr w:type="spellEnd"/>
-      <w:r>
-        <w:t xml:space="preserve"> en op de specifieke leerbehoeften van deze doelgroep.</w:t>
-      </w:r>
+        <w:t>Welke ondersteuningsbehoeften hebben leraren bij het differentiëren voor hoogbegaafde leerlingen, en welke rol zien zij voor een AI-onderwijsassistent?</w:t>
+      </w:r>
+    </w:p>
+    <w:p>
+      <w:pPr>
+        <w:pStyle w:val="Geenafstand"/>
+      </w:pPr>
+    </w:p>
+    <w:p>
+      <w:pPr>
+        <w:pStyle w:val="Geenafstand"/>
+      </w:pPr>
+      <w:r>
+        <w:t xml:space="preserve">Uit de verkenning, de analyse van een bestaand platform (Arcadin) en de vroege gebruikerstest met twee leraren komt naar voren dat leraren vooral behoefte hebben aan tijdsbesparing bij het zoeken en samenstellen van passend materiaal, aan helder inzicht in niveau en voortgang per leerling, en aan een overzichtelijke, rustige interface die laagdrempelig is voor dagelijks gebruik. De gewenste rol van de AI is nadrukkelijk </w:t>
+      </w:r>
+      <w:r>
+        <w:rPr>
+          <w:b/>
+          <w:bCs/>
+        </w:rPr>
+        <w:t>ondersteunend, niet vervangend</w:t>
+      </w:r>
+      <w:r>
+        <w:t>: de leraar wil de regie houden over welke opdrachten een leerling krijgt. Dit beeld is in het ontwerp vertaald naar een signalerend en adviserend systeem waarin de leraar altijd het eindoordeel velt. Wel is dit onderdeel nog beperkt onderzocht</w:t>
+      </w:r>
+      <w:r>
+        <w:t xml:space="preserve">, </w:t>
+      </w:r>
+      <w:r>
+        <w:t>de bevindingen berusten op een kleine groep en op ontwerpgerichte tests; een bredere, formele behoeftepeiling onder leraren is voorzien als vervolg (zie ook §7.7 en Future Work).</w:t>
+      </w:r>
+    </w:p>
+    <w:p>
+      <w:pPr>
+        <w:pStyle w:val="Geenafstand"/>
+      </w:pPr>
     </w:p>
     <w:p>
       <w:pPr>
@@ -5933,13 +5939,14 @@
       <w:pPr>
         <w:pStyle w:val="Kop2"/>
       </w:pPr>
-      <w:bookmarkStart w:id="95" w:name="_Toc231238775"/>
-      <w:bookmarkStart w:id="96" w:name="_Toc231285601"/>
-      <w:r>
-        <w:t>7.2 Deelvraag 2 — Gebruikersbehoeften en rolverdeling</w:t>
-      </w:r>
-      <w:bookmarkEnd w:id="95"/>
-      <w:bookmarkEnd w:id="96"/>
+      <w:bookmarkStart w:id="97" w:name="_Toc231238776"/>
+      <w:bookmarkStart w:id="98" w:name="_Toc231285602"/>
+      <w:r>
+        <w:lastRenderedPageBreak/>
+        <w:t>7.3 Deelvraag 3 — Verantwoord AI-ontwerp</w:t>
+      </w:r>
+      <w:bookmarkEnd w:id="97"/>
+      <w:bookmarkEnd w:id="98"/>
     </w:p>
     <w:p>
       <w:pPr>
@@ -5954,84 +5961,89 @@
           <w:i/>
           <w:iCs/>
         </w:rPr>
-        <w:t>Welke ondersteuningsbehoeften hebben leraren bij het differentiëren voor hoogbegaafde leerlingen, en welke rol zien zij voor een AI-onderwijsassistent?</w:t>
-      </w:r>
-    </w:p>
-    <w:p>
-      <w:pPr>
-        <w:pStyle w:val="Geenafstand"/>
-      </w:pPr>
-    </w:p>
-    <w:p>
-      <w:pPr>
-        <w:pStyle w:val="Geenafstand"/>
-      </w:pPr>
-      <w:r>
-        <w:t>Uit de verkenning, de analyse van een bestaand platform (</w:t>
-      </w:r>
-      <w:proofErr w:type="spellStart"/>
-      <w:r>
-        <w:t>Arcadin</w:t>
-      </w:r>
-      <w:proofErr w:type="spellEnd"/>
-      <w:r>
-        <w:t xml:space="preserve">) en de vroege gebruikerstest met twee leraren komt naar voren dat leraren vooral behoefte hebben aan tijdsbesparing bij het zoeken en samenstellen van passend materiaal, aan helder inzicht in niveau en voortgang per leerling, en aan een overzichtelijke, rustige interface die laagdrempelig is voor dagelijks gebruik. De gewenste rol van de AI is nadrukkelijk </w:t>
+        <w:t>Aan welke ethische en technische randvoorwaarden moet de assistent voldoen om verantwoord, uitlegbaar en privacyveilig te zijn in een context met minderjarige gebruikers?</w:t>
+      </w:r>
+    </w:p>
+    <w:p>
+      <w:pPr>
+        <w:pStyle w:val="Geenafstand"/>
+      </w:pPr>
+    </w:p>
+    <w:p>
+      <w:pPr>
+        <w:pStyle w:val="Geenafstand"/>
+      </w:pPr>
+      <w:r>
+        <w:t xml:space="preserve">Het onderzoek identificeert vier randvoorwaarden, die alle in het ontwerp zijn verankerd. </w:t>
       </w:r>
       <w:r>
         <w:rPr>
           <w:b/>
           <w:bCs/>
         </w:rPr>
-        <w:t>ondersteunend, niet vervangend</w:t>
-      </w:r>
-      <w:r>
-        <w:t>: de leraar wil de regie houden over welke opdrachten een leerling krijgt. Dit beeld is in het ontwerp vertaald naar een signalerend en adviserend systeem waarin de leraar altijd het eindoordeel velt. Wel is dit onderdeel nog beperkt onderzocht</w:t>
-      </w:r>
-      <w:r>
-        <w:t xml:space="preserve">, </w:t>
-      </w:r>
-      <w:r>
-        <w:t xml:space="preserve">de bevindingen berusten op een kleine groep en op ontwerpgerichte tests; een bredere, formele behoeftepeiling onder leraren is voorzien als vervolg (zie ook §7.7 en </w:t>
+        <w:t>Privacy (AVG):</w:t>
+      </w:r>
+      <w:r>
+        <w:t xml:space="preserve"> omdat het systeem met gegevens van minderjarigen werkt, draaien alle AI-componenten lokaal, zodat leerlingdata de eigen infrastructuur niet verlaat; in het proof of concept wordt bovendien uitsluitend met fictieve data gewerkt. </w:t>
+      </w:r>
+      <w:r>
+        <w:rPr>
+          <w:b/>
+          <w:bCs/>
+        </w:rPr>
+        <w:t>Uitlegbaarheid (XAI):</w:t>
+      </w:r>
+      <w:r>
+        <w:t xml:space="preserve"> elke aanbeveling en gegenereerde opdracht gaat vergezeld van een onderbouwing en, waar van toepassing, een verwijzing naar de gebruikte profielbronnen, zodat de leraar de redenering kan volgen en beoordelen. </w:t>
+      </w:r>
+      <w:r>
+        <w:rPr>
+          <w:b/>
+          <w:bCs/>
+        </w:rPr>
+        <w:t>Menselijk toezicht (EU AI Act, art. 14):</w:t>
+      </w:r>
+      <w:r>
+        <w:t xml:space="preserve"> de leraar keurt opdrachten goed of af en kan bijsturen. </w:t>
+      </w:r>
+      <w:r>
+        <w:rPr>
+          <w:b/>
+          <w:bCs/>
+        </w:rPr>
+        <w:t>Kwaliteitsborging:</w:t>
+      </w:r>
+      <w:r>
+        <w:t xml:space="preserve"> een geautomatiseerde kwaliteitscontrole (LLM-as-</w:t>
       </w:r>
       <w:proofErr w:type="spellStart"/>
       <w:r>
-        <w:t>Future</w:t>
+        <w:t>judge</w:t>
       </w:r>
       <w:proofErr w:type="spellEnd"/>
       <w:r>
-        <w:t xml:space="preserve"> </w:t>
+        <w:t xml:space="preserve">) toetst gegenereerde opdrachten op wetenschappelijk onderbouwde criteria voordat ze de leraar bereiken. Een nog openstaande randvoorwaarde is de beveiliging van gebruikersinvoer tegen prompt </w:t>
       </w:r>
       <w:proofErr w:type="spellStart"/>
       <w:r>
-        <w:t>Work</w:t>
+        <w:t>injection</w:t>
       </w:r>
       <w:proofErr w:type="spellEnd"/>
       <w:r>
-        <w:t>).</w:t>
-      </w:r>
-    </w:p>
-    <w:p>
-      <w:pPr>
-        <w:pStyle w:val="Geenafstand"/>
-      </w:pPr>
-    </w:p>
-    <w:p>
-      <w:pPr>
-        <w:pStyle w:val="Geenafstand"/>
-      </w:pPr>
+        <w:t>; dit is als concrete aanbeveling opgenomen.</w:t>
+      </w:r>
     </w:p>
     <w:p>
       <w:pPr>
         <w:pStyle w:val="Kop2"/>
       </w:pPr>
-      <w:bookmarkStart w:id="97" w:name="_Toc231238776"/>
-      <w:bookmarkStart w:id="98" w:name="_Toc231285602"/>
-      <w:r>
-        <w:lastRenderedPageBreak/>
-        <w:t>7.3 Deelvraag 3 — Verantwoord AI-ontwerp</w:t>
-      </w:r>
-      <w:bookmarkEnd w:id="97"/>
-      <w:bookmarkEnd w:id="98"/>
+      <w:bookmarkStart w:id="99" w:name="_Toc231238777"/>
+      <w:bookmarkStart w:id="100" w:name="_Toc231285603"/>
+      <w:r>
+        <w:t>7.4 Deelvraag 4 — Technische haalbaarheid</w:t>
+      </w:r>
+      <w:bookmarkEnd w:id="99"/>
+      <w:bookmarkEnd w:id="100"/>
     </w:p>
     <w:p>
       <w:pPr>
@@ -6046,459 +6058,250 @@
           <w:i/>
           <w:iCs/>
         </w:rPr>
-        <w:t xml:space="preserve">Aan welke ethische en technische randvoorwaarden moet de assistent voldoen om verantwoord, uitlegbaar en </w:t>
+        <w:t>Welke AI-architectuur, interfaces en datatypes zijn technisch haalbaar voor een proof of concept, gegeven de randvoorwaarden van verantwoord ontwerp, AVG en pedagogische kwaliteit?</w:t>
+      </w:r>
+    </w:p>
+    <w:p>
+      <w:pPr>
+        <w:pStyle w:val="Geenafstand"/>
+      </w:pPr>
+    </w:p>
+    <w:p>
+      <w:pPr>
+        <w:pStyle w:val="Geenafstand"/>
+      </w:pPr>
+      <w:r>
+        <w:t xml:space="preserve">De technische haalbaarheid is aangetoond met een werkend proof of concept. De architectuur bestaat uit een Next.js-webapplicatie, een </w:t>
       </w:r>
       <w:proofErr w:type="spellStart"/>
       <w:r>
+        <w:t>PostgreSQL</w:t>
+      </w:r>
+      <w:proofErr w:type="spellEnd"/>
+      <w:r>
+        <w:t>-database met vectoropslag (</w:t>
+      </w:r>
+      <w:proofErr w:type="spellStart"/>
+      <w:r>
+        <w:t>pgvector</w:t>
+      </w:r>
+      <w:proofErr w:type="spellEnd"/>
+      <w:r>
+        <w:t xml:space="preserve">) en lokaal gehoste taalmodellen via </w:t>
+      </w:r>
+      <w:proofErr w:type="spellStart"/>
+      <w:r>
+        <w:t>Ollama</w:t>
+      </w:r>
+      <w:proofErr w:type="spellEnd"/>
+      <w:r>
+        <w:t>. OPP-documenten worden ingelezen, opgesplitst in fragmenten en omgezet naar meertalige vectorrepresentaties, waardoor semantisch zoeken mogelijk is. Op deze basis draaien meerdere samenwerkende AI-functies: een RAG/RAS-pipeline voor opdrachtgeneratie, een kwaliteitsbeoordeling (</w:t>
+      </w:r>
+      <w:proofErr w:type="spellStart"/>
+      <w:r>
+        <w:t>judge</w:t>
+      </w:r>
+      <w:proofErr w:type="spellEnd"/>
+      <w:r>
+        <w:t xml:space="preserve">), beeldanalyse van </w:t>
+      </w:r>
+      <w:proofErr w:type="spellStart"/>
+      <w:r>
+        <w:t>leerlingwerk</w:t>
+      </w:r>
+      <w:proofErr w:type="spellEnd"/>
+      <w:r>
+        <w:t xml:space="preserve"> via een </w:t>
+      </w:r>
+      <w:proofErr w:type="spellStart"/>
+      <w:r>
+        <w:t>vision</w:t>
+      </w:r>
+      <w:proofErr w:type="spellEnd"/>
+      <w:r>
+        <w:t>-model en illustratiegeneratie. De semantische zoekfunctie is technisch gevalideerd (similarity-tests). Hiermee is aangetoond dat een verantwoorde, volledig lokaal draaiende AI-architectuur haalbaar is binnen de gestelde randvoorwaarden. De voornaamste technische beperkingen liggen in de benodigde GPU-capaciteit en in het feit dat enkele onderdelen nog niet formeel zijn geëvalueerd.</w:t>
+      </w:r>
+    </w:p>
+    <w:p>
+      <w:pPr>
+        <w:pStyle w:val="Kop2"/>
+      </w:pPr>
+      <w:bookmarkStart w:id="101" w:name="_Toc231238778"/>
+      <w:bookmarkStart w:id="102" w:name="_Toc231285604"/>
+      <w:r>
+        <w:t>7.5 Deelvraag 5 — Mens-AI-samenwerking</w:t>
+      </w:r>
+      <w:bookmarkEnd w:id="101"/>
+      <w:bookmarkEnd w:id="102"/>
+    </w:p>
+    <w:p>
+      <w:pPr>
+        <w:pStyle w:val="Geenafstand"/>
         <w:rPr>
           <w:i/>
           <w:iCs/>
         </w:rPr>
-        <w:t>privacyveilig</w:t>
-      </w:r>
-      <w:proofErr w:type="spellEnd"/>
+      </w:pPr>
       <w:r>
         <w:rPr>
           <w:i/>
           <w:iCs/>
         </w:rPr>
-        <w:t xml:space="preserve"> te zijn in een context met minderjarige gebruikers?</w:t>
-      </w:r>
-    </w:p>
-    <w:p>
-      <w:pPr>
-        <w:pStyle w:val="Geenafstand"/>
-      </w:pPr>
-    </w:p>
-    <w:p>
-      <w:pPr>
-        <w:pStyle w:val="Geenafstand"/>
-      </w:pPr>
-      <w:r>
-        <w:t xml:space="preserve">Het onderzoek identificeert vier randvoorwaarden, die alle in het ontwerp zijn verankerd. </w:t>
+        <w:t>Hoe kan de interactie tussen leraar en AI zo worden vormgegeven dat de leraar de professionele regie behoudt en de AI transparant communiceert?</w:t>
+      </w:r>
+    </w:p>
+    <w:p>
+      <w:pPr>
+        <w:pStyle w:val="Geenafstand"/>
+      </w:pPr>
+    </w:p>
+    <w:p>
+      <w:pPr>
+        <w:pStyle w:val="Geenafstand"/>
+      </w:pPr>
+      <w:r>
+        <w:t xml:space="preserve">De samenwerking is vormgegeven volgens het principe van Hybride AI: de AI neemt de schaalbare, repetitieve taken op zich (personalisatie, signaleren, voortgang volgen), terwijl de leraar de taken behoudt die menselijk oordeel vereisen (pedagogische beslissingen en de relatie met de leerling). Dit is concreet gemaakt door verschillende human-in-the-loop-mechanismen: </w:t>
+      </w:r>
+    </w:p>
+    <w:p>
+      <w:pPr>
+        <w:pStyle w:val="Geenafstand"/>
+      </w:pPr>
+      <w:r>
+        <w:lastRenderedPageBreak/>
+        <w:t>signalen en adviezen eindigen met een open vraag aan de leraar, gegenereerde opdrachten moeten door de leraar worden goedgekeurd of afgekeurd, afgekeurde opdrachten en leerkrachtfeedback worden hergebruikt om volgende suggesties te verbeteren, en een leraarsnotitie stuurt de AI bij als leidende context. Doordat het systeem bij elke aanbeveling laat zien waaróp deze is gebaseerd, blijft de redenering transparant en kan de leraar deze corrigeren of aanvullen. Zo behoudt de leraar te allen tijde de eindregie.</w:t>
+      </w:r>
+    </w:p>
+    <w:p>
+      <w:pPr>
+        <w:pStyle w:val="Kop2"/>
+      </w:pPr>
+      <w:bookmarkStart w:id="103" w:name="_Toc231238779"/>
+      <w:bookmarkStart w:id="104" w:name="_Toc231285605"/>
+      <w:r>
+        <w:t>7.6 Beantwoording van de hoofdvraag</w:t>
+      </w:r>
+      <w:bookmarkEnd w:id="103"/>
+      <w:bookmarkEnd w:id="104"/>
+    </w:p>
+    <w:p>
+      <w:pPr>
+        <w:pStyle w:val="Geenafstand"/>
+        <w:rPr>
+          <w:i/>
+          <w:iCs/>
+        </w:rPr>
+      </w:pPr>
+      <w:r>
+        <w:rPr>
+          <w:i/>
+          <w:iCs/>
+        </w:rPr>
+        <w:t>Op welke manier kan een AI-onderwijsassistent (Juf Aimee) op verantwoorde, uitlegbare en mensgerichte wijze worden ontworpen om leraren te ondersteunen bij het personaliseren van onderwijs voor hoogbegaafde leerlingen?</w:t>
+      </w:r>
+    </w:p>
+    <w:p>
+      <w:pPr>
+        <w:pStyle w:val="Geenafstand"/>
+      </w:pPr>
+    </w:p>
+    <w:p>
+      <w:pPr>
+        <w:pStyle w:val="Geenafstand"/>
+      </w:pPr>
+      <w:r>
+        <w:t xml:space="preserve">Het onderzoek laat zien dat dit mogelijk is door drie ontwerpkeuzes te combineren tot één samenhangend systeem. </w:t>
       </w:r>
       <w:r>
         <w:rPr>
           <w:b/>
           <w:bCs/>
         </w:rPr>
-        <w:t>Privacy (AVG):</w:t>
-      </w:r>
-      <w:r>
-        <w:t xml:space="preserve"> omdat het systeem met gegevens van minderjarigen werkt, draaien alle AI-componenten lokaal, zodat </w:t>
-      </w:r>
-      <w:proofErr w:type="spellStart"/>
-      <w:r>
-        <w:t>leerlingdata</w:t>
-      </w:r>
-      <w:proofErr w:type="spellEnd"/>
-      <w:r>
-        <w:t xml:space="preserve"> de eigen infrastructuur niet verlaat; in het </w:t>
-      </w:r>
-      <w:proofErr w:type="spellStart"/>
-      <w:r>
-        <w:t>proof</w:t>
-      </w:r>
-      <w:proofErr w:type="spellEnd"/>
-      <w:r>
-        <w:t xml:space="preserve"> of concept wordt bovendien uitsluitend met fictieve data gewerkt. </w:t>
+        <w:t>Ten eerste</w:t>
+      </w:r>
+      <w:r>
+        <w:t xml:space="preserve"> een profielgestuurde generatie-aanpak (RAG/RAS) die opdrachten verankert in het individuele ontwikkelingsperspectief en de Taxonomie van Bloom, zodat personalisatie aansluit bij de werkelijke leerbehoeften van de hoogbegaafde leerling. </w:t>
       </w:r>
       <w:r>
         <w:rPr>
           <w:b/>
           <w:bCs/>
         </w:rPr>
-        <w:t>Uitlegbaarheid (XAI):</w:t>
-      </w:r>
-      <w:r>
-        <w:t xml:space="preserve"> elke aanbeveling en gegenereerde opdracht gaat vergezeld van een onderbouwing en, waar van toepassing, een verwijzing naar de gebruikte profielbronnen, zodat de leraar de redenering kan volgen en beoordelen. </w:t>
+        <w:t>Ten tweede</w:t>
+      </w:r>
+      <w:r>
+        <w:t xml:space="preserve"> een verantwoorde technische basis: lokaal gehoste modellen die de privacy van minderjarigen waarborgen, aangevuld met een geautomatiseerde kwaliteitscontrole die zwakke opdrachten tegenhoudt. </w:t>
       </w:r>
       <w:r>
         <w:rPr>
           <w:b/>
           <w:bCs/>
         </w:rPr>
-        <w:t>Menselijk toezicht (EU AI Act, art. 14):</w:t>
-      </w:r>
-      <w:r>
-        <w:t xml:space="preserve"> de leraar keurt opdrachten goed of af en kan bijsturen. </w:t>
-      </w:r>
-      <w:r>
+        <w:t>Ten derde</w:t>
+      </w:r>
+      <w:r>
+        <w:t xml:space="preserve"> een mensgerichte interactie waarin de leraar de eindbeslisser blijft en het systeem zijn redenering uitlegbaar maakt.</w:t>
+      </w:r>
+    </w:p>
+    <w:p>
+      <w:pPr>
+        <w:pStyle w:val="Geenafstand"/>
+      </w:pPr>
+    </w:p>
+    <w:p>
+      <w:pPr>
+        <w:pStyle w:val="Geenafstand"/>
+      </w:pPr>
+      <w:r>
+        <w:t xml:space="preserve">Het gerealiseerde proof of concept toont aan dat zo'n verantwoord, uitlegbaar en mensgericht ontwerp technisch haalbaar is en de leraar daadwerkelijk ondersteunt zonder diens professionele regie over te nemen. Juf Aimee functioneert daarmee aantoonbaar als een </w:t>
+      </w:r>
+      <w:r>
+        <w:rPr>
+          <w:i/>
+          <w:iCs/>
+        </w:rPr>
+        <w:t>AI-collega</w:t>
+      </w:r>
+      <w:r>
+        <w:t xml:space="preserve"> die de leraar versterkt in plaats van vervangt. Hiermee wordt de hoofdvraag bevestigend beantwoord, met de kanttekening dat verdere validatie nodig is voordat het systeem in de praktijk kan worden ingezet.</w:t>
+      </w:r>
+    </w:p>
+    <w:p>
+      <w:pPr>
+        <w:pStyle w:val="Geenafstand"/>
+      </w:pPr>
+    </w:p>
+    <w:p>
+      <w:pPr>
+        <w:pStyle w:val="Geenafstand"/>
         <w:rPr>
           <w:b/>
           <w:bCs/>
         </w:rPr>
-        <w:t>Kwaliteitsborging:</w:t>
-      </w:r>
-      <w:r>
-        <w:t xml:space="preserve"> een geautomatiseerde kwaliteitscontrole (LLM-as-</w:t>
-      </w:r>
-      <w:proofErr w:type="spellStart"/>
-      <w:r>
-        <w:t>judge</w:t>
-      </w:r>
-      <w:proofErr w:type="spellEnd"/>
-      <w:r>
-        <w:t xml:space="preserve">) toetst gegenereerde opdrachten op wetenschappelijk onderbouwde criteria voordat ze de leraar bereiken. Een nog openstaande randvoorwaarde is de beveiliging van gebruikersinvoer tegen prompt </w:t>
-      </w:r>
-      <w:proofErr w:type="spellStart"/>
-      <w:r>
-        <w:t>injection</w:t>
-      </w:r>
-      <w:proofErr w:type="spellEnd"/>
-      <w:r>
-        <w:t>; dit is als concrete aanbeveling opgenomen.</w:t>
-      </w:r>
-    </w:p>
-    <w:p>
-      <w:pPr>
-        <w:pStyle w:val="Kop2"/>
-      </w:pPr>
-      <w:bookmarkStart w:id="99" w:name="_Toc231238777"/>
-      <w:bookmarkStart w:id="100" w:name="_Toc231285603"/>
-      <w:r>
-        <w:t>7.4 Deelvraag 4 — Technische haalbaarheid</w:t>
-      </w:r>
-      <w:bookmarkEnd w:id="99"/>
-      <w:bookmarkEnd w:id="100"/>
-    </w:p>
-    <w:p>
-      <w:pPr>
-        <w:pStyle w:val="Geenafstand"/>
-        <w:rPr>
-          <w:i/>
-          <w:iCs/>
-        </w:rPr>
-      </w:pPr>
-      <w:r>
-        <w:rPr>
-          <w:i/>
-          <w:iCs/>
-        </w:rPr>
-        <w:t xml:space="preserve">Welke AI-architectuur, interfaces en datatypes zijn technisch haalbaar voor een </w:t>
-      </w:r>
-      <w:proofErr w:type="spellStart"/>
-      <w:r>
-        <w:rPr>
-          <w:i/>
-          <w:iCs/>
-        </w:rPr>
-        <w:t>proof</w:t>
-      </w:r>
-      <w:proofErr w:type="spellEnd"/>
-      <w:r>
-        <w:rPr>
-          <w:i/>
-          <w:iCs/>
-        </w:rPr>
-        <w:t xml:space="preserve"> of concept, gegeven de randvoorwaarden van verantwoord ontwerp, AVG en pedagogische kwaliteit?</w:t>
-      </w:r>
-    </w:p>
-    <w:p>
-      <w:pPr>
-        <w:pStyle w:val="Geenafstand"/>
-      </w:pPr>
-    </w:p>
-    <w:p>
-      <w:pPr>
-        <w:pStyle w:val="Geenafstand"/>
-      </w:pPr>
-      <w:r>
-        <w:t xml:space="preserve">De technische haalbaarheid is aangetoond met een werkend </w:t>
-      </w:r>
-      <w:proofErr w:type="spellStart"/>
-      <w:r>
-        <w:t>proof</w:t>
-      </w:r>
-      <w:proofErr w:type="spellEnd"/>
-      <w:r>
-        <w:t xml:space="preserve"> of concept. De architectuur bestaat uit een Next.js-webapplicatie, een </w:t>
-      </w:r>
-      <w:proofErr w:type="spellStart"/>
-      <w:r>
-        <w:t>PostgreSQL</w:t>
-      </w:r>
-      <w:proofErr w:type="spellEnd"/>
-      <w:r>
-        <w:t>-database met vectoropslag (</w:t>
-      </w:r>
-      <w:proofErr w:type="spellStart"/>
-      <w:r>
-        <w:t>pgvector</w:t>
-      </w:r>
-      <w:proofErr w:type="spellEnd"/>
-      <w:r>
-        <w:t xml:space="preserve">) en lokaal gehoste taalmodellen via </w:t>
-      </w:r>
-      <w:proofErr w:type="spellStart"/>
-      <w:r>
-        <w:t>Ollama</w:t>
-      </w:r>
-      <w:proofErr w:type="spellEnd"/>
-      <w:r>
-        <w:t>. OPP-documenten worden ingelezen, opgesplitst in fragmenten en omgezet naar meertalige vectorrepresentaties, waardoor semantisch zoeken mogelijk is. Op deze basis draaien meerdere samenwerkende AI-functies: een RAG/RAS-pipeline voor opdrachtgeneratie, een kwaliteitsbeoordeling (</w:t>
-      </w:r>
-      <w:proofErr w:type="spellStart"/>
-      <w:r>
-        <w:t>judge</w:t>
-      </w:r>
-      <w:proofErr w:type="spellEnd"/>
-      <w:r>
-        <w:t xml:space="preserve">), beeldanalyse van </w:t>
-      </w:r>
-      <w:proofErr w:type="spellStart"/>
-      <w:r>
-        <w:t>leerlingwerk</w:t>
-      </w:r>
-      <w:proofErr w:type="spellEnd"/>
-      <w:r>
-        <w:t xml:space="preserve"> via een </w:t>
-      </w:r>
-      <w:proofErr w:type="spellStart"/>
-      <w:r>
-        <w:t>vision</w:t>
-      </w:r>
-      <w:proofErr w:type="spellEnd"/>
-      <w:r>
-        <w:t>-model en illustratiegeneratie. De semantische zoekfunctie is technisch gevalideerd (</w:t>
-      </w:r>
-      <w:proofErr w:type="spellStart"/>
-      <w:r>
-        <w:t>similarity</w:t>
-      </w:r>
-      <w:proofErr w:type="spellEnd"/>
-      <w:r>
-        <w:t>-tests). Hiermee is aangetoond dat een verantwoorde, volledig lokaal draaiende AI-architectuur haalbaar is binnen de gestelde randvoorwaarden. De voornaamste technische beperkingen liggen in de benodigde GPU-capaciteit en in het feit dat enkele onderdelen nog niet formeel zijn geëvalueerd.</w:t>
-      </w:r>
-    </w:p>
-    <w:p>
-      <w:pPr>
-        <w:pStyle w:val="Kop2"/>
-      </w:pPr>
-      <w:bookmarkStart w:id="101" w:name="_Toc231238778"/>
-      <w:bookmarkStart w:id="102" w:name="_Toc231285604"/>
-      <w:r>
-        <w:t>7.5 Deelvraag 5 — Mens-AI-samenwerking</w:t>
-      </w:r>
-      <w:bookmarkEnd w:id="101"/>
-      <w:bookmarkEnd w:id="102"/>
-    </w:p>
-    <w:p>
-      <w:pPr>
-        <w:pStyle w:val="Geenafstand"/>
-        <w:rPr>
-          <w:i/>
-          <w:iCs/>
-        </w:rPr>
-      </w:pPr>
-      <w:r>
-        <w:rPr>
-          <w:i/>
-          <w:iCs/>
-        </w:rPr>
-        <w:t>Hoe kan de interactie tussen leraar en AI zo worden vormgegeven dat de leraar de professionele regie behoudt en de AI transparant communiceert?</w:t>
-      </w:r>
-    </w:p>
-    <w:p>
-      <w:pPr>
-        <w:pStyle w:val="Geenafstand"/>
-      </w:pPr>
-    </w:p>
-    <w:p>
-      <w:pPr>
-        <w:pStyle w:val="Geenafstand"/>
-      </w:pPr>
-      <w:r>
-        <w:t>De samenwerking is vormgegeven volgens het principe van Hybride AI: de AI neemt de schaalbare, repetitieve taken op zich (personalisatie, signaleren, voortgang volgen), terwijl de leraar de taken behoudt die menselijk oordeel vereisen (pedagogische beslissingen en de relatie met de leerling). Dit is concreet gemaakt door verschillende human-in-</w:t>
-      </w:r>
-      <w:proofErr w:type="spellStart"/>
-      <w:r>
-        <w:t>the</w:t>
-      </w:r>
-      <w:proofErr w:type="spellEnd"/>
-      <w:r>
-        <w:t xml:space="preserve">-loop-mechanismen: signalen </w:t>
-      </w:r>
-      <w:r>
-        <w:lastRenderedPageBreak/>
-        <w:t>en adviezen eindigen met een open vraag aan de leraar, gegenereerde opdrachten moeten door de leraar worden goedgekeurd of afgekeurd, afgekeurde opdrachten en leerkrachtfeedback worden hergebruikt om volgende suggesties te verbeteren, en een leraarsnotitie stuurt de AI bij als leidende context. Doordat het systeem bij elke aanbeveling laat zien waaróp deze is gebaseerd, blijft de redenering transparant en kan de leraar deze corrigeren of aanvullen. Zo behoudt de leraar te allen tijde de eindregie.</w:t>
-      </w:r>
-    </w:p>
-    <w:p>
-      <w:pPr>
-        <w:pStyle w:val="Kop2"/>
-      </w:pPr>
-      <w:bookmarkStart w:id="103" w:name="_Toc231238779"/>
-      <w:bookmarkStart w:id="104" w:name="_Toc231285605"/>
-      <w:r>
-        <w:t>7.6 Beantwoording van de hoofdvraag</w:t>
-      </w:r>
-      <w:bookmarkEnd w:id="103"/>
-      <w:bookmarkEnd w:id="104"/>
-    </w:p>
-    <w:p>
-      <w:pPr>
-        <w:pStyle w:val="Geenafstand"/>
-        <w:rPr>
-          <w:i/>
-          <w:iCs/>
-        </w:rPr>
-      </w:pPr>
-      <w:r>
-        <w:rPr>
-          <w:i/>
-          <w:iCs/>
-        </w:rPr>
-        <w:t>Op welke manier kan een AI-onderwijsassistent (Juf Aimee) op verantwoorde, uitlegbare en mensgerichte wijze worden ontworpen om leraren te ondersteunen bij het personaliseren van onderwijs voor hoogbegaafde leerlingen?</w:t>
-      </w:r>
-    </w:p>
-    <w:p>
-      <w:pPr>
-        <w:pStyle w:val="Geenafstand"/>
-      </w:pPr>
-    </w:p>
-    <w:p>
-      <w:pPr>
-        <w:pStyle w:val="Geenafstand"/>
-      </w:pPr>
-      <w:r>
-        <w:t xml:space="preserve">Het onderzoek laat zien dat dit mogelijk is door drie ontwerpkeuzes te combineren tot één samenhangend systeem. </w:t>
-      </w:r>
+      </w:pPr>
       <w:r>
         <w:rPr>
           <w:b/>
           <w:bCs/>
         </w:rPr>
-        <w:t>Ten eerste</w:t>
-      </w:r>
-      <w:r>
-        <w:t xml:space="preserve"> een </w:t>
-      </w:r>
-      <w:proofErr w:type="spellStart"/>
-      <w:r>
-        <w:t>profielgestuurde</w:t>
-      </w:r>
-      <w:proofErr w:type="spellEnd"/>
-      <w:r>
-        <w:t xml:space="preserve"> generatie-aanpak (RAG/RAS) die opdrachten verankert in het individuele ontwikkelingsperspectief en de Taxonomie van </w:t>
-      </w:r>
-      <w:proofErr w:type="spellStart"/>
-      <w:r>
-        <w:t>Bloom</w:t>
-      </w:r>
-      <w:proofErr w:type="spellEnd"/>
-      <w:r>
-        <w:t xml:space="preserve">, zodat personalisatie aansluit bij de werkelijke leerbehoeften van de hoogbegaafde leerling. </w:t>
-      </w:r>
-      <w:r>
+        <w:t>7.7 Beperkingen en reikwijdte</w:t>
+      </w:r>
+    </w:p>
+    <w:p>
+      <w:pPr>
+        <w:pStyle w:val="Geenafstand"/>
         <w:rPr>
           <w:b/>
           <w:bCs/>
         </w:rPr>
-        <w:t>Ten tweede</w:t>
-      </w:r>
-      <w:r>
-        <w:t xml:space="preserve"> een verantwoorde technische basis: lokaal gehoste modellen die de privacy van minderjarigen waarborgen, aangevuld met een geautomatiseerde kwaliteitscontrole die zwakke opdrachten tegenhoudt. </w:t>
-      </w:r>
-      <w:r>
-        <w:rPr>
-          <w:b/>
-          <w:bCs/>
-        </w:rPr>
-        <w:t>Ten derde</w:t>
-      </w:r>
-      <w:r>
-        <w:t xml:space="preserve"> een mensgerichte interactie waarin de leraar de eindbeslisser blijft en het systeem zijn redenering uitlegbaar maakt.</w:t>
-      </w:r>
-    </w:p>
-    <w:p>
-      <w:pPr>
-        <w:pStyle w:val="Geenafstand"/>
-      </w:pPr>
-      <w:r>
-        <w:t xml:space="preserve">Het gerealiseerde </w:t>
-      </w:r>
-      <w:proofErr w:type="spellStart"/>
-      <w:r>
-        <w:t>proof</w:t>
-      </w:r>
-      <w:proofErr w:type="spellEnd"/>
-      <w:r>
-        <w:t xml:space="preserve"> of concept toont aan dat zo'n verantwoord, uitlegbaar en mensgericht </w:t>
-      </w:r>
-      <w:proofErr w:type="gramStart"/>
-      <w:r>
-        <w:t>ontwerp technisch</w:t>
-      </w:r>
-      <w:proofErr w:type="gramEnd"/>
-      <w:r>
-        <w:t xml:space="preserve"> haalbaar is en de leraar daadwerkelijk ondersteunt zonder diens professionele regie over te nemen. Juf Aimee functioneert daarmee aantoonbaar als een </w:t>
-      </w:r>
-      <w:r>
-        <w:rPr>
-          <w:i/>
-          <w:iCs/>
-        </w:rPr>
-        <w:t>AI-collega</w:t>
-      </w:r>
-      <w:r>
-        <w:t xml:space="preserve"> die de leraar versterkt in plaats van vervangt. Hiermee wordt de hoofdvraag bevestigend beantwoord, met de kanttekening dat verdere validatie nodig is voordat het systeem in de praktijk kan worden ingezet.</w:t>
-      </w:r>
-    </w:p>
-    <w:p>
-      <w:pPr>
-        <w:pStyle w:val="Geenafstand"/>
-        <w:rPr>
-          <w:b/>
-          <w:bCs/>
-        </w:rPr>
-      </w:pPr>
-      <w:r>
-        <w:rPr>
-          <w:b/>
-          <w:bCs/>
-        </w:rPr>
-        <w:t>7.7 Beperkingen en reikwijdte</w:t>
-      </w:r>
-    </w:p>
-    <w:p>
-      <w:pPr>
-        <w:pStyle w:val="Geenafstand"/>
-      </w:pPr>
-      <w:r>
-        <w:t xml:space="preserve">De conclusies zijn gebaseerd op een </w:t>
-      </w:r>
-      <w:proofErr w:type="spellStart"/>
-      <w:r>
-        <w:t>proof</w:t>
-      </w:r>
-      <w:proofErr w:type="spellEnd"/>
-      <w:r>
-        <w:t xml:space="preserve"> of concept in een vroege fase. Het onderzoek werkte uitsluitend met fictieve </w:t>
-      </w:r>
-      <w:proofErr w:type="spellStart"/>
-      <w:r>
-        <w:t>leerlingdata</w:t>
-      </w:r>
-      <w:proofErr w:type="spellEnd"/>
-      <w:r>
-        <w:t xml:space="preserve">, de gebruikersevaluatie betrof een kleine groep en richtte zich vooral op het dashboard en de semantische zoekfunctie, en enkele onderdelen — waaronder het signalensysteem, de kwaliteitsbeoordeling en het feedbacksysteem voor visuele opdrachten — zijn nog niet formeel gevalideerd met eindgebruikers. Ook de beveiliging van gebruikersinvoer vraagt nog aandacht. Deze punten doen niets af aan de aangetoonde haalbaarheid, maar bakenen af wat er nodig is voor een verantwoorde opschaling. De vervolgstappen hiervoor zijn beschreven in de hoofdstukken Aanbevelingen en </w:t>
-      </w:r>
-      <w:proofErr w:type="spellStart"/>
-      <w:r>
-        <w:t>Future</w:t>
-      </w:r>
-      <w:proofErr w:type="spellEnd"/>
-      <w:r>
-        <w:t xml:space="preserve"> </w:t>
-      </w:r>
-      <w:proofErr w:type="spellStart"/>
-      <w:r>
-        <w:t>Work</w:t>
-      </w:r>
-      <w:proofErr w:type="spellEnd"/>
-      <w:r>
-        <w:t>.</w:t>
+      </w:pPr>
+    </w:p>
+    <w:p>
+      <w:pPr>
+        <w:pStyle w:val="Geenafstand"/>
+      </w:pPr>
+      <w:r>
+        <w:t>De conclusies zijn gebaseerd op een proof of concept in een vroege fase. Het onderzoek werkte uitsluitend met fictieve leerlingdata, de gebruikersevaluatie betrof een kleine groep en richtte zich vooral op het dashboard en de semantische zoekfunctie, en enkele onderdelen — waaronder het signalensysteem, de kwaliteitsbeoordeling en het feedbacksysteem voor visuele opdrachten — zijn nog niet formeel gevalideerd met eindgebruikers. Ook de beveiliging van gebruikersinvoer vraagt nog aandacht. Deze punten doen niets af aan de aangetoonde haalbaarheid, maar bakenen af wat er nodig is voor een verantwoorde opschaling. De vervolgstappen hiervoor zijn beschreven in de hoofdstukken Aanbevelingen en Future Work.</w:t>
       </w:r>
     </w:p>
     <w:p>
@@ -7114,8 +6917,8 @@
         <w:pStyle w:val="Kop2"/>
       </w:pPr>
       <w:bookmarkStart w:id="118" w:name="_Toc231190417"/>
-      <w:bookmarkStart w:id="119" w:name="_Toc230782970"/>
-      <w:bookmarkStart w:id="120" w:name="_Toc231285611"/>
+      <w:bookmarkStart w:id="119" w:name="_Toc231285611"/>
+      <w:bookmarkStart w:id="120" w:name="_Toc230782970"/>
       <w:r>
         <w:t>10</w:t>
       </w:r>
@@ -7133,7 +6936,7 @@
         <w:t xml:space="preserve"> in de AI-pipeline</w:t>
       </w:r>
       <w:bookmarkEnd w:id="118"/>
-      <w:bookmarkEnd w:id="120"/>
+      <w:bookmarkEnd w:id="119"/>
     </w:p>
     <w:p>
       <w:pPr>
@@ -7407,7 +7210,7 @@
       <w:r>
         <w:t>.2 RAS verrijken met individuele leerlingvoortgang</w:t>
       </w:r>
-      <w:bookmarkEnd w:id="119"/>
+      <w:bookmarkEnd w:id="120"/>
       <w:bookmarkEnd w:id="121"/>
       <w:bookmarkEnd w:id="122"/>
     </w:p>
@@ -8532,15 +8335,10 @@
       </w:r>
       <w:proofErr w:type="spellEnd"/>
       <w:r>
-        <w:t xml:space="preserve"> van </w:t>
-      </w:r>
-      <w:proofErr w:type="spellStart"/>
-      <w:r>
-        <w:t>leerlingdata</w:t>
+        <w:t xml:space="preserve"> van leerlingdata</w:t>
       </w:r>
       <w:bookmarkEnd w:id="129"/>
       <w:bookmarkEnd w:id="130"/>
-      <w:proofErr w:type="spellEnd"/>
     </w:p>
     <w:p>
       <w:pPr>

</xml_diff>